<commit_message>
Documents: author's estimates, singular
Three occurrences of "the authors'" corrected in a single-author package.
</commit_message>
<xml_diff>
--- a/documents/AI-SAF-Framework-v0.7.1.docx
+++ b/documents/AI-SAF-Framework-v0.7.1.docx
@@ -9103,7 +9103,7 @@
         <w:t xml:space="preserve"> </w:t>
       </w:r>
       <w:r>
-        <w:t xml:space="preserve">platform on BNP’s own GPUs in its own data centres; disciplined governance. (Both profiles below are the authors’ estimates from public information — see the Evidence Base’s verification note.)</w:t>
+        <w:t>platform on BNP’s own GPUs in its own data centres; disciplined governance. (Both profiles below are the author’s estimates from public information — see the Evidence Base’s verification note.)</w:t>
       </w:r>
     </w:p>
     <w:p>
@@ -15150,7 +15150,7 @@
         <w:pStyle w:val="FirstParagraph"/>
       </w:pPr>
       <w:r>
-        <w:t xml:space="preserve">All three examples follow the same sequence: pillar table → rule-stability → alliance → operating-model → final. These are the authors’ estimates from public information, shown to demonstrate the method.</w:t>
+        <w:t>All three examples follow the same sequence: pillar table → rule-stability → alliance → operating-model → final. These are the author’s estimates from public information, shown to demonstrate the method.</w:t>
       </w:r>
     </w:p>
     <w:p>
@@ -19303,7 +19303,7 @@
         <w:t xml:space="preserve"> </w:t>
       </w:r>
       <w:r>
-        <w:t xml:space="preserve">Three cautions about how this was put together. First, the field moves faster than the sources can keep up: items confirmed here in April 2026 will eventually be out of date; the entries marked [Added v0.7.1] were verified in August 2026 and the same caution applies to them. Second, performance claims from vendors (FLOPS, memory bandwidth, benchmark scores) should be read as the maker’s own specs, not as figures someone independently reproduced. Third, the scoring examples for specific firms (BNP Paribas, ING) in the framework documents are the authors’ own estimates from public information — they show how the method works, and are not official outside assessments.</w:t>
+        <w:t>Three cautions about how this was put together. First, the field moves faster than the sources can keep up: items confirmed here in April 2026 will eventually be out of date; the entries marked [Added v0.7.1] were verified in August 2026 and the same caution applies to them. Second, performance claims from vendors (FLOPS, memory bandwidth, benchmark scores) should be read as the maker’s own specs, not as figures someone independently reproduced. Third, the scoring examples for specific firms (BNP Paribas, ING) in the framework documents are the author’s own estimates from public information — they show how the method works, and are not official outside assessments.</w:t>
       </w:r>
     </w:p>
     <w:p>

</xml_diff>